<commit_message>
Fix vendor spreadsheet (210 clean USD rows, aligned column names), regen 12 differentiated CVs, align Ex4 prompt column references
Co-authored-by: Copilot <223556219+Copilot@users.noreply.github.com>
</commit_message>
<xml_diff>
--- a/samples/CVs/CV_01_Dewi_Saputra.docx
+++ b/samples/CVs/CV_01_Dewi_Saputra.docx
@@ -7,7 +7,7 @@
         <w:rPr>
           <w:b/>
           <w:color w:val="4A3728"/>
-          <w:sz w:val="44"/>
+          <w:sz w:val="40"/>
         </w:rPr>
         <w:t>Dewi Saputra</w:t>
       </w:r>
@@ -15,6 +15,8 @@
     <w:p>
       <w:r>
         <w:rPr>
+          <w:i/>
+          <w:color w:val="C9A227"/>
           <w:sz w:val="22"/>
         </w:rPr>
         <w:t>Target role: Mine Site Supervisor</w:t>
@@ -23,17 +25,19 @@
     <w:p>
       <w:r>
         <w:rPr>
-          <w:sz w:val="22"/>
+          <w:b w:val="0"/>
+          <w:sz w:val="20"/>
         </w:rPr>
-        <w:t>Location: Bandung · WNI · Available: Immediately</w:t>
+        <w:t>Location: Sorowako, Sulawesi  |  Citizenship: WNI  |  Availability: Immediate</w:t>
       </w:r>
     </w:p>
     <w:p>
       <w:r>
         <w:rPr>
-          <w:sz w:val="22"/>
+          <w:b w:val="0"/>
+          <w:sz w:val="20"/>
         </w:rPr>
-        <w:t>Email: dewi.saputra@example.co.id · Mobile: +62 810145801</w:t>
+        <w:t>Email: dewi.saputra@example.com  |  Phone: +62 812 4501 8823</w:t>
       </w:r>
     </w:p>
     <w:p>
@@ -47,36 +51,30 @@
       </w:r>
     </w:p>
     <w:p>
-      <w:pPr>
-        <w:pStyle w:val="ListBullet"/>
-      </w:pPr>
       <w:r>
         <w:rPr>
-          <w:sz w:val="22"/>
+          <w:b w:val="0"/>
+          <w:sz w:val="21"/>
         </w:rPr>
-        <w:t>Ten years progressive experience in open-pit gold and copper operations across Sulawesi and Kalimantan.</w:t>
+        <w:t>Mine site supervisor with 12 years in open-pit gold and nickel operations across Sulawesi.</w:t>
       </w:r>
     </w:p>
     <w:p>
-      <w:pPr>
-        <w:pStyle w:val="ListBullet"/>
-      </w:pPr>
       <w:r>
         <w:rPr>
-          <w:sz w:val="22"/>
+          <w:b w:val="0"/>
+          <w:sz w:val="21"/>
         </w:rPr>
-        <w:t>Certified POP (Pengawas Operasional Pratama) and POM (Pengawas Operasional Madya) under Kepmen ESDM 1827.</w:t>
+        <w:t>Track record of running 24-hour production shifts of 60+ crew with zero LTI in the last 30 months.</w:t>
       </w:r>
     </w:p>
     <w:p>
-      <w:pPr>
-        <w:pStyle w:val="ListBullet"/>
-      </w:pPr>
       <w:r>
         <w:rPr>
-          <w:sz w:val="22"/>
+          <w:b w:val="0"/>
+          <w:sz w:val="21"/>
         </w:rPr>
-        <w:t>Track record supervising crews of 40 to 60, delivering zero LTI over the last 3 years.</w:t>
+        <w:t>POM certified, comfortable presenting daily production and safety numbers directly to expat mine managers.</w:t>
       </w:r>
     </w:p>
     <w:p>
@@ -95,7 +93,16 @@
           <w:b/>
           <w:sz w:val="22"/>
         </w:rPr>
-        <w:t>2023-present · Shift Supervisor · PT Merdeka Copper Gold, Tujuh Bukit</w:t>
+        <w:t>Senior Mine Supervisor - PT Vale Indonesia</w:t>
+      </w:r>
+    </w:p>
+    <w:p>
+      <w:r>
+        <w:rPr>
+          <w:b w:val="0"/>
+          <w:sz w:val="20"/>
+        </w:rPr>
+        <w:t>Mar 2020 - present  |  Sorowako</w:t>
       </w:r>
     </w:p>
     <w:p>
@@ -104,9 +111,9 @@
       </w:pPr>
       <w:r>
         <w:rPr>
-          <w:sz w:val="22"/>
+          <w:sz w:val="21"/>
         </w:rPr>
-        <w:t>Supervised drill and blast crew, 45 personnel per shift.</w:t>
+        <w:t>Led A-crew of 62 across drill, blast, load and haul in the East Block, hitting 118% of monthly BCM plan.</w:t>
       </w:r>
     </w:p>
     <w:p>
@@ -115,9 +122,9 @@
       </w:pPr>
       <w:r>
         <w:rPr>
-          <w:sz w:val="22"/>
+          <w:sz w:val="21"/>
         </w:rPr>
-        <w:t>Held safety talk daily, zero LTI for consecutive 36 months.</w:t>
+        <w:t>Drove 30 consecutive months without a Lost Time Injury through the site-wide Take 5 rollout.</w:t>
       </w:r>
     </w:p>
     <w:p>
@@ -126,9 +133,9 @@
       </w:pPr>
       <w:r>
         <w:rPr>
-          <w:sz w:val="22"/>
+          <w:sz w:val="21"/>
         </w:rPr>
-        <w:t>Reduced blast delay by 22 percent through pre-shift readiness checks.</w:t>
+        <w:t>Mentored 8 junior supervisors, 5 promoted to shift lead within 24 months.</w:t>
       </w:r>
     </w:p>
     <w:p>
@@ -137,7 +144,16 @@
           <w:b/>
           <w:sz w:val="22"/>
         </w:rPr>
-        <w:t>2019-2023 · Section Supervisor · PT Amman Mineral, Batu Hijau</w:t>
+        <w:t>Mine Supervisor - PT Antam Pongkor</w:t>
+      </w:r>
+    </w:p>
+    <w:p>
+      <w:r>
+        <w:rPr>
+          <w:b w:val="0"/>
+          <w:sz w:val="20"/>
+        </w:rPr>
+        <w:t>Aug 2016 - Feb 2020  |  Bogor</w:t>
       </w:r>
     </w:p>
     <w:p>
@@ -146,9 +162,9 @@
       </w:pPr>
       <w:r>
         <w:rPr>
-          <w:sz w:val="22"/>
+          <w:sz w:val="21"/>
         </w:rPr>
-        <w:t>Coordinated haul truck fleet of 32 units against production plan.</w:t>
+        <w:t>Ran night-shift production for the Ciguha underground zone, average 850 tpd.</w:t>
       </w:r>
     </w:p>
     <w:p>
@@ -157,9 +173,27 @@
       </w:pPr>
       <w:r>
         <w:rPr>
+          <w:sz w:val="21"/>
+        </w:rPr>
+        <w:t>Deployed short-interval control boards that lifted crew utilisation from 71% to 84%.</w:t>
+      </w:r>
+    </w:p>
+    <w:p>
+      <w:r>
+        <w:rPr>
+          <w:b/>
           <w:sz w:val="22"/>
         </w:rPr>
-        <w:t>Introduced tyre life tracking, extended average life by 8 percent.</w:t>
+        <w:t>Shift Foreman - PT Bumi Resources (KPC)</w:t>
+      </w:r>
+    </w:p>
+    <w:p>
+      <w:r>
+        <w:rPr>
+          <w:b w:val="0"/>
+          <w:sz w:val="20"/>
+        </w:rPr>
+        <w:t>Jun 2013 - Jul 2016  |  Sangatta, East Kalimantan</w:t>
       </w:r>
     </w:p>
     <w:p>
@@ -168,18 +202,9 @@
       </w:pPr>
       <w:r>
         <w:rPr>
-          <w:sz w:val="22"/>
+          <w:sz w:val="21"/>
         </w:rPr>
-        <w:t>Mentored 6 junior supervisors, 4 promoted to Shift Supervisor.</w:t>
-      </w:r>
-    </w:p>
-    <w:p>
-      <w:r>
-        <w:rPr>
-          <w:b/>
-          <w:sz w:val="22"/>
-        </w:rPr>
-        <w:t>2015-2019 · Foreman · PT Vale Indonesia, Sorowako</w:t>
+        <w:t>Frontline supervision of 20-crew haul team on Caterpillar 785C fleet.</w:t>
       </w:r>
     </w:p>
     <w:p>
@@ -188,20 +213,9 @@
       </w:pPr>
       <w:r>
         <w:rPr>
-          <w:sz w:val="22"/>
+          <w:sz w:val="21"/>
         </w:rPr>
-        <w:t>Front-line supervision of open-pit development operations.</w:t>
-      </w:r>
-    </w:p>
-    <w:p>
-      <w:pPr>
-        <w:pStyle w:val="ListBullet"/>
-      </w:pPr>
-      <w:r>
-        <w:rPr>
-          <w:sz w:val="22"/>
-        </w:rPr>
-        <w:t>Led toolbox meetings, safety observation rate above target.</w:t>
+        <w:t>Reduced tyre incidents by 40% through pre-shift road inspections.</w:t>
       </w:r>
     </w:p>
     <w:p>
@@ -215,25 +229,21 @@
       </w:r>
     </w:p>
     <w:p>
-      <w:pPr>
-        <w:pStyle w:val="ListBullet"/>
-      </w:pPr>
       <w:r>
         <w:rPr>
-          <w:sz w:val="22"/>
+          <w:b w:val="0"/>
+          <w:sz w:val="21"/>
         </w:rPr>
-        <w:t>S1 Teknik Pertambangan, Universitas Hasanuddin</w:t>
+        <w:t>Bachelor of Mining Engineering, Universitas Hasanuddin, 2013.</w:t>
       </w:r>
     </w:p>
     <w:p>
-      <w:pPr>
-        <w:pStyle w:val="ListBullet"/>
-      </w:pPr>
       <w:r>
         <w:rPr>
-          <w:sz w:val="22"/>
+          <w:b w:val="0"/>
+          <w:sz w:val="21"/>
         </w:rPr>
-        <w:t>D3 Teknik Pertambangan, ITB</w:t>
+        <w:t>Advanced Supervisor Programme, Curtin WA Short Course, 2019.</w:t>
       </w:r>
     </w:p>
     <w:p>
@@ -252,9 +262,9 @@
       </w:pPr>
       <w:r>
         <w:rPr>
-          <w:sz w:val="22"/>
+          <w:sz w:val="21"/>
         </w:rPr>
-        <w:t>POP</w:t>
+        <w:t>POM (Pengawas Operasional Madya) - active</w:t>
       </w:r>
     </w:p>
     <w:p>
@@ -263,9 +273,9 @@
       </w:pPr>
       <w:r>
         <w:rPr>
-          <w:sz w:val="22"/>
+          <w:sz w:val="21"/>
         </w:rPr>
-        <w:t>POM</w:t>
+        <w:t>First Aid at Work - Palang Merah Indonesia</w:t>
       </w:r>
     </w:p>
     <w:p>
@@ -274,9 +284,9 @@
       </w:pPr>
       <w:r>
         <w:rPr>
-          <w:sz w:val="22"/>
+          <w:sz w:val="21"/>
         </w:rPr>
-        <w:t>First Aid &amp; CPR (2024)</w:t>
+        <w:t>MSHA Surface refresher, 2025</w:t>
       </w:r>
     </w:p>
     <w:p>
@@ -292,14 +302,43 @@
     <w:p>
       <w:r>
         <w:rPr>
-          <w:sz w:val="22"/>
+          <w:b w:val="0"/>
+          <w:sz w:val="21"/>
         </w:rPr>
-        <w:t>Bahasa Indonesia (native), English (fluent), Bugis (conversational)</w:t>
+        <w:t>Bahasa Indonesia (native), English (fluent), Bugis (conversational).</w:t>
+      </w:r>
+    </w:p>
+    <w:p>
+      <w:r>
+        <w:rPr>
+          <w:b/>
+          <w:color w:val="4A3728"/>
+          <w:sz w:val="28"/>
+        </w:rPr>
+        <w:t>References</w:t>
+      </w:r>
+    </w:p>
+    <w:p>
+      <w:r>
+        <w:rPr>
+          <w:b w:val="0"/>
+          <w:sz w:val="21"/>
+        </w:rPr>
+        <w:t>Ir. Suryanto Halim, Mine Manager, PT Vale Indonesia.</w:t>
+      </w:r>
+    </w:p>
+    <w:p>
+      <w:r>
+        <w:rPr>
+          <w:b w:val="0"/>
+          <w:sz w:val="21"/>
+        </w:rPr>
+        <w:t>Ibu Maria Tampubolon, HR Business Partner, PT Antam.</w:t>
       </w:r>
     </w:p>
     <w:sectPr>
       <w:pgSz w:w="12240" w:h="15840"/>
-      <w:pgMar w:top="1020" w:right="1134" w:bottom="1020" w:left="1134" w:header="720" w:footer="720" w:gutter="0"/>
+      <w:pgMar w:top="864" w:right="1008" w:bottom="864" w:left="1008" w:header="720" w:footer="720" w:gutter="0"/>
       <w:cols w:space="720"/>
       <w:docGrid w:linePitch="360"/>
     </w:sectPr>

</xml_diff>